<commit_message>
Update to Beta Tester Questionnaire 05/06/26
</commit_message>
<xml_diff>
--- a/MODULE-10/BETA_TESTER_QUESTIONS.docx
+++ b/MODULE-10/BETA_TESTER_QUESTIONS.docx
@@ -61,7 +61,7 @@
         <w:pStyle w:val="ListParagraph"/>
         <w:numPr>
           <w:ilvl w:val="0"/>
-          <w:numId w:val="1"/>
+          <w:numId w:val="5"/>
         </w:numPr>
       </w:pPr>
       <w:r>
@@ -73,19 +73,25 @@
         <w:pStyle w:val="ListParagraph"/>
         <w:numPr>
           <w:ilvl w:val="1"/>
-          <w:numId w:val="1"/>
+          <w:numId w:val="5"/>
         </w:numPr>
       </w:pPr>
       <w:r>
         <w:t>.</w:t>
       </w:r>
+    </w:p>
+    <w:p>
+      <w:pPr>
+        <w:pStyle w:val="ListParagraph"/>
+        <w:ind w:left="1440"/>
+      </w:pPr>
     </w:p>
     <w:p>
       <w:pPr>
         <w:pStyle w:val="ListParagraph"/>
         <w:numPr>
           <w:ilvl w:val="0"/>
-          <w:numId w:val="1"/>
+          <w:numId w:val="5"/>
         </w:numPr>
       </w:pPr>
       <w:r>
@@ -103,19 +109,25 @@
         <w:pStyle w:val="ListParagraph"/>
         <w:numPr>
           <w:ilvl w:val="1"/>
-          <w:numId w:val="1"/>
+          <w:numId w:val="5"/>
         </w:numPr>
       </w:pPr>
       <w:r>
         <w:t>.</w:t>
       </w:r>
+    </w:p>
+    <w:p>
+      <w:pPr>
+        <w:pStyle w:val="ListParagraph"/>
+        <w:ind w:left="1440"/>
+      </w:pPr>
     </w:p>
     <w:p>
       <w:pPr>
         <w:pStyle w:val="ListParagraph"/>
         <w:numPr>
           <w:ilvl w:val="0"/>
-          <w:numId w:val="1"/>
+          <w:numId w:val="5"/>
         </w:numPr>
       </w:pPr>
       <w:r>
@@ -127,19 +139,25 @@
         <w:pStyle w:val="ListParagraph"/>
         <w:numPr>
           <w:ilvl w:val="1"/>
-          <w:numId w:val="1"/>
+          <w:numId w:val="5"/>
         </w:numPr>
       </w:pPr>
       <w:r>
         <w:t>.</w:t>
       </w:r>
+    </w:p>
+    <w:p>
+      <w:pPr>
+        <w:pStyle w:val="ListParagraph"/>
+        <w:ind w:left="1440"/>
+      </w:pPr>
     </w:p>
     <w:p>
       <w:pPr>
         <w:pStyle w:val="ListParagraph"/>
         <w:numPr>
           <w:ilvl w:val="0"/>
-          <w:numId w:val="1"/>
+          <w:numId w:val="5"/>
         </w:numPr>
       </w:pPr>
       <w:r>
@@ -151,19 +169,25 @@
         <w:pStyle w:val="ListParagraph"/>
         <w:numPr>
           <w:ilvl w:val="1"/>
-          <w:numId w:val="1"/>
+          <w:numId w:val="5"/>
         </w:numPr>
       </w:pPr>
       <w:r>
         <w:t>.</w:t>
       </w:r>
+    </w:p>
+    <w:p>
+      <w:pPr>
+        <w:pStyle w:val="ListParagraph"/>
+        <w:ind w:left="1440"/>
+      </w:pPr>
     </w:p>
     <w:p>
       <w:pPr>
         <w:pStyle w:val="ListParagraph"/>
         <w:numPr>
           <w:ilvl w:val="0"/>
-          <w:numId w:val="1"/>
+          <w:numId w:val="5"/>
         </w:numPr>
       </w:pPr>
       <w:r>
@@ -175,8 +199,324 @@
         <w:pStyle w:val="ListParagraph"/>
         <w:numPr>
           <w:ilvl w:val="1"/>
-          <w:numId w:val="1"/>
+          <w:numId w:val="5"/>
         </w:numPr>
+      </w:pPr>
+      <w:r>
+        <w:t>.</w:t>
+      </w:r>
+    </w:p>
+    <w:p>
+      <w:pPr>
+        <w:pStyle w:val="ListParagraph"/>
+        <w:ind w:left="1440"/>
+      </w:pPr>
+    </w:p>
+    <w:p>
+      <w:pPr>
+        <w:pStyle w:val="ListParagraph"/>
+        <w:numPr>
+          <w:ilvl w:val="0"/>
+          <w:numId w:val="5"/>
+        </w:numPr>
+        <w:spacing w:before="100" w:beforeAutospacing="1" w:after="100" w:afterAutospacing="1" w:line="240" w:lineRule="auto"/>
+        <w:rPr>
+          <w:rFonts w:ascii="Times New Roman" w:eastAsia="Times New Roman" w:hAnsi="Times New Roman" w:cs="Times New Roman"/>
+          <w:kern w:val="0"/>
+          <w14:ligatures w14:val="none"/>
+        </w:rPr>
+      </w:pPr>
+      <w:r>
+        <w:rPr>
+          <w:rFonts w:ascii="Times New Roman" w:eastAsia="Times New Roman" w:hAnsi="Times New Roman" w:cs="Times New Roman"/>
+          <w:kern w:val="0"/>
+          <w14:ligatures w14:val="none"/>
+        </w:rPr>
+        <w:t>Were all buttons, links, and navigation menus functioning properly throughout the website?</w:t>
+      </w:r>
+      <w:r>
+        <w:rPr>
+          <w:rFonts w:ascii="Times New Roman" w:eastAsia="Times New Roman" w:hAnsi="Times New Roman" w:cs="Times New Roman"/>
+          <w:kern w:val="0"/>
+          <w14:ligatures w14:val="none"/>
+        </w:rPr>
+        <w:br/>
+      </w:r>
+      <w:proofErr w:type="gramStart"/>
+      <w:r>
+        <w:rPr>
+          <w:rFonts w:ascii="Times New Roman" w:eastAsia="Times New Roman" w:hAnsi="Times New Roman" w:cs="Times New Roman"/>
+          <w:kern w:val="0"/>
+          <w14:ligatures w14:val="none"/>
+        </w:rPr>
+        <w:t>a. .</w:t>
+      </w:r>
+      <w:proofErr w:type="gramEnd"/>
+      <w:r>
+        <w:rPr>
+          <w:rFonts w:ascii="Times New Roman" w:eastAsia="Times New Roman" w:hAnsi="Times New Roman" w:cs="Times New Roman"/>
+          <w:kern w:val="0"/>
+          <w14:ligatures w14:val="none"/>
+        </w:rPr>
+        <w:t xml:space="preserve"> </w:t>
+      </w:r>
+    </w:p>
+    <w:p>
+      <w:pPr>
+        <w:pStyle w:val="ListParagraph"/>
+        <w:spacing w:before="100" w:beforeAutospacing="1" w:after="100" w:afterAutospacing="1" w:line="240" w:lineRule="auto"/>
+        <w:rPr>
+          <w:rFonts w:ascii="Times New Roman" w:eastAsia="Times New Roman" w:hAnsi="Times New Roman" w:cs="Times New Roman"/>
+          <w:kern w:val="0"/>
+          <w14:ligatures w14:val="none"/>
+        </w:rPr>
+      </w:pPr>
+    </w:p>
+    <w:p>
+      <w:pPr>
+        <w:pStyle w:val="ListParagraph"/>
+        <w:numPr>
+          <w:ilvl w:val="0"/>
+          <w:numId w:val="5"/>
+        </w:numPr>
+        <w:spacing w:before="100" w:beforeAutospacing="1" w:after="100" w:afterAutospacing="1" w:line="240" w:lineRule="auto"/>
+        <w:rPr>
+          <w:rFonts w:ascii="Times New Roman" w:eastAsia="Times New Roman" w:hAnsi="Times New Roman" w:cs="Times New Roman"/>
+          <w:kern w:val="0"/>
+          <w14:ligatures w14:val="none"/>
+        </w:rPr>
+      </w:pPr>
+      <w:r>
+        <w:rPr>
+          <w:rFonts w:ascii="Times New Roman" w:eastAsia="Times New Roman" w:hAnsi="Times New Roman" w:cs="Times New Roman"/>
+          <w:kern w:val="0"/>
+          <w14:ligatures w14:val="none"/>
+        </w:rPr>
+        <w:t>Did the website pages load in a reasonable amount of time on your device? Explain if any pages seemed slow.</w:t>
+      </w:r>
+      <w:r>
+        <w:rPr>
+          <w:rFonts w:ascii="Times New Roman" w:eastAsia="Times New Roman" w:hAnsi="Times New Roman" w:cs="Times New Roman"/>
+          <w:kern w:val="0"/>
+          <w14:ligatures w14:val="none"/>
+        </w:rPr>
+        <w:br/>
+      </w:r>
+      <w:proofErr w:type="gramStart"/>
+      <w:r>
+        <w:rPr>
+          <w:rFonts w:ascii="Times New Roman" w:eastAsia="Times New Roman" w:hAnsi="Times New Roman" w:cs="Times New Roman"/>
+          <w:kern w:val="0"/>
+          <w14:ligatures w14:val="none"/>
+        </w:rPr>
+        <w:t>a. .</w:t>
+      </w:r>
+      <w:proofErr w:type="gramEnd"/>
+      <w:r>
+        <w:rPr>
+          <w:rFonts w:ascii="Times New Roman" w:eastAsia="Times New Roman" w:hAnsi="Times New Roman" w:cs="Times New Roman"/>
+          <w:kern w:val="0"/>
+          <w14:ligatures w14:val="none"/>
+        </w:rPr>
+        <w:t xml:space="preserve"> </w:t>
+      </w:r>
+    </w:p>
+    <w:p>
+      <w:pPr>
+        <w:pStyle w:val="ListParagraph"/>
+        <w:rPr>
+          <w:rFonts w:ascii="Times New Roman" w:eastAsia="Times New Roman" w:hAnsi="Times New Roman" w:cs="Times New Roman"/>
+          <w:kern w:val="0"/>
+          <w14:ligatures w14:val="none"/>
+        </w:rPr>
+      </w:pPr>
+    </w:p>
+    <w:p>
+      <w:pPr>
+        <w:pStyle w:val="ListParagraph"/>
+        <w:spacing w:before="100" w:beforeAutospacing="1" w:after="100" w:afterAutospacing="1" w:line="240" w:lineRule="auto"/>
+        <w:rPr>
+          <w:rFonts w:ascii="Times New Roman" w:eastAsia="Times New Roman" w:hAnsi="Times New Roman" w:cs="Times New Roman"/>
+          <w:kern w:val="0"/>
+          <w14:ligatures w14:val="none"/>
+        </w:rPr>
+      </w:pPr>
+    </w:p>
+    <w:p>
+      <w:pPr>
+        <w:pStyle w:val="ListParagraph"/>
+        <w:numPr>
+          <w:ilvl w:val="0"/>
+          <w:numId w:val="5"/>
+        </w:numPr>
+        <w:spacing w:before="100" w:beforeAutospacing="1" w:after="100" w:afterAutospacing="1" w:line="240" w:lineRule="auto"/>
+        <w:rPr>
+          <w:rFonts w:ascii="Times New Roman" w:eastAsia="Times New Roman" w:hAnsi="Times New Roman" w:cs="Times New Roman"/>
+          <w:kern w:val="0"/>
+          <w14:ligatures w14:val="none"/>
+        </w:rPr>
+      </w:pPr>
+      <w:r>
+        <w:rPr>
+          <w:rFonts w:ascii="Times New Roman" w:eastAsia="Times New Roman" w:hAnsi="Times New Roman" w:cs="Times New Roman"/>
+          <w:kern w:val="0"/>
+          <w14:ligatures w14:val="none"/>
+        </w:rPr>
+        <w:lastRenderedPageBreak/>
+        <w:t>Was the information on the website clear and easy to understand, including reservation details and pricing?</w:t>
+      </w:r>
+      <w:r>
+        <w:rPr>
+          <w:rFonts w:ascii="Times New Roman" w:eastAsia="Times New Roman" w:hAnsi="Times New Roman" w:cs="Times New Roman"/>
+          <w:kern w:val="0"/>
+          <w14:ligatures w14:val="none"/>
+        </w:rPr>
+        <w:br/>
+      </w:r>
+      <w:proofErr w:type="gramStart"/>
+      <w:r>
+        <w:rPr>
+          <w:rFonts w:ascii="Times New Roman" w:eastAsia="Times New Roman" w:hAnsi="Times New Roman" w:cs="Times New Roman"/>
+          <w:kern w:val="0"/>
+          <w14:ligatures w14:val="none"/>
+        </w:rPr>
+        <w:t>a. .</w:t>
+      </w:r>
+      <w:proofErr w:type="gramEnd"/>
+      <w:r>
+        <w:rPr>
+          <w:rFonts w:ascii="Times New Roman" w:eastAsia="Times New Roman" w:hAnsi="Times New Roman" w:cs="Times New Roman"/>
+          <w:kern w:val="0"/>
+          <w14:ligatures w14:val="none"/>
+        </w:rPr>
+        <w:t xml:space="preserve"> </w:t>
+      </w:r>
+    </w:p>
+    <w:p>
+      <w:pPr>
+        <w:pStyle w:val="ListParagraph"/>
+        <w:spacing w:before="100" w:beforeAutospacing="1" w:after="100" w:afterAutospacing="1" w:line="240" w:lineRule="auto"/>
+        <w:rPr>
+          <w:rFonts w:ascii="Times New Roman" w:eastAsia="Times New Roman" w:hAnsi="Times New Roman" w:cs="Times New Roman"/>
+          <w:kern w:val="0"/>
+          <w14:ligatures w14:val="none"/>
+        </w:rPr>
+      </w:pPr>
+    </w:p>
+    <w:p>
+      <w:pPr>
+        <w:pStyle w:val="ListParagraph"/>
+        <w:numPr>
+          <w:ilvl w:val="0"/>
+          <w:numId w:val="5"/>
+        </w:numPr>
+        <w:spacing w:before="100" w:beforeAutospacing="1" w:after="100" w:afterAutospacing="1" w:line="240" w:lineRule="auto"/>
+        <w:rPr>
+          <w:rFonts w:ascii="Times New Roman" w:eastAsia="Times New Roman" w:hAnsi="Times New Roman" w:cs="Times New Roman"/>
+          <w:kern w:val="0"/>
+          <w14:ligatures w14:val="none"/>
+        </w:rPr>
+      </w:pPr>
+      <w:r>
+        <w:rPr>
+          <w:rFonts w:ascii="Times New Roman" w:eastAsia="Times New Roman" w:hAnsi="Times New Roman" w:cs="Times New Roman"/>
+          <w:kern w:val="0"/>
+          <w14:ligatures w14:val="none"/>
+        </w:rPr>
+        <w:t>Did the website make you feel confident and comfortable booking a reservation online? Why or why not?</w:t>
+      </w:r>
+      <w:r>
+        <w:rPr>
+          <w:rFonts w:ascii="Times New Roman" w:eastAsia="Times New Roman" w:hAnsi="Times New Roman" w:cs="Times New Roman"/>
+          <w:kern w:val="0"/>
+          <w14:ligatures w14:val="none"/>
+        </w:rPr>
+        <w:br/>
+      </w:r>
+      <w:proofErr w:type="gramStart"/>
+      <w:r>
+        <w:rPr>
+          <w:rFonts w:ascii="Times New Roman" w:eastAsia="Times New Roman" w:hAnsi="Times New Roman" w:cs="Times New Roman"/>
+          <w:kern w:val="0"/>
+          <w14:ligatures w14:val="none"/>
+        </w:rPr>
+        <w:t>a. .</w:t>
+      </w:r>
+      <w:proofErr w:type="gramEnd"/>
+      <w:r>
+        <w:rPr>
+          <w:rFonts w:ascii="Times New Roman" w:eastAsia="Times New Roman" w:hAnsi="Times New Roman" w:cs="Times New Roman"/>
+          <w:kern w:val="0"/>
+          <w14:ligatures w14:val="none"/>
+        </w:rPr>
+        <w:t xml:space="preserve"> </w:t>
+      </w:r>
+    </w:p>
+    <w:p>
+      <w:pPr>
+        <w:pStyle w:val="ListParagraph"/>
+        <w:rPr>
+          <w:rFonts w:ascii="Times New Roman" w:eastAsia="Times New Roman" w:hAnsi="Times New Roman" w:cs="Times New Roman"/>
+          <w:kern w:val="0"/>
+          <w14:ligatures w14:val="none"/>
+        </w:rPr>
+      </w:pPr>
+    </w:p>
+    <w:p>
+      <w:pPr>
+        <w:pStyle w:val="ListParagraph"/>
+        <w:spacing w:before="100" w:beforeAutospacing="1" w:after="100" w:afterAutospacing="1" w:line="240" w:lineRule="auto"/>
+        <w:rPr>
+          <w:rFonts w:ascii="Times New Roman" w:eastAsia="Times New Roman" w:hAnsi="Times New Roman" w:cs="Times New Roman"/>
+          <w:kern w:val="0"/>
+          <w14:ligatures w14:val="none"/>
+        </w:rPr>
+      </w:pPr>
+    </w:p>
+    <w:p>
+      <w:pPr>
+        <w:pStyle w:val="ListParagraph"/>
+        <w:numPr>
+          <w:ilvl w:val="0"/>
+          <w:numId w:val="5"/>
+        </w:numPr>
+        <w:spacing w:before="100" w:beforeAutospacing="1" w:after="100" w:afterAutospacing="1" w:line="240" w:lineRule="auto"/>
+        <w:rPr>
+          <w:rFonts w:ascii="Times New Roman" w:eastAsia="Times New Roman" w:hAnsi="Times New Roman" w:cs="Times New Roman"/>
+          <w:kern w:val="0"/>
+          <w14:ligatures w14:val="none"/>
+        </w:rPr>
+      </w:pPr>
+      <w:r>
+        <w:rPr>
+          <w:rFonts w:ascii="Times New Roman" w:eastAsia="Times New Roman" w:hAnsi="Times New Roman" w:cs="Times New Roman"/>
+          <w:kern w:val="0"/>
+          <w14:ligatures w14:val="none"/>
+        </w:rPr>
+        <w:t>Was the layout of the website consistent across all pages, and did it help improve your overall experience?</w:t>
+      </w:r>
+      <w:r>
+        <w:rPr>
+          <w:rFonts w:ascii="Times New Roman" w:eastAsia="Times New Roman" w:hAnsi="Times New Roman" w:cs="Times New Roman"/>
+          <w:kern w:val="0"/>
+          <w14:ligatures w14:val="none"/>
+        </w:rPr>
+        <w:br/>
+      </w:r>
+      <w:proofErr w:type="gramStart"/>
+      <w:r>
+        <w:rPr>
+          <w:rFonts w:ascii="Times New Roman" w:eastAsia="Times New Roman" w:hAnsi="Times New Roman" w:cs="Times New Roman"/>
+          <w:kern w:val="0"/>
+          <w14:ligatures w14:val="none"/>
+        </w:rPr>
+        <w:t>a. .</w:t>
+      </w:r>
+      <w:proofErr w:type="gramEnd"/>
+    </w:p>
+    <w:p>
+      <w:pPr>
+        <w:pStyle w:val="ListParagraph"/>
       </w:pPr>
     </w:p>
     <w:sectPr>
@@ -263,6 +603,92 @@
 <file path=word/numbering.xml><?xml version="1.0" encoding="utf-8"?>
 <w:numbering xmlns:wpc="http://schemas.microsoft.com/office/word/2010/wordprocessingCanvas" xmlns:cx="http://schemas.microsoft.com/office/drawing/2014/chartex" xmlns:cx1="http://schemas.microsoft.com/office/drawing/2015/9/8/chartex" xmlns:cx2="http://schemas.microsoft.com/office/drawing/2015/10/21/chartex" xmlns:cx3="http://schemas.microsoft.com/office/drawing/2016/5/9/chartex" xmlns:cx4="http://schemas.microsoft.com/office/drawing/2016/5/10/chartex" xmlns:cx5="http://schemas.microsoft.com/office/drawing/2016/5/11/chartex" xmlns:cx6="http://schemas.microsoft.com/office/drawing/2016/5/12/chartex" xmlns:cx7="http://schemas.microsoft.com/office/drawing/2016/5/13/chartex" xmlns:cx8="http://schemas.microsoft.com/office/drawing/2016/5/14/chartex" xmlns:mc="http://schemas.openxmlformats.org/markup-compatibility/2006" xmlns:aink="http://schemas.microsoft.com/office/drawing/2016/ink" xmlns:am3d="http://schemas.microsoft.com/office/drawing/2017/model3d" xmlns:o="urn:schemas-microsoft-com:office:office" xmlns:oel="http://schemas.microsoft.com/office/2019/extlst" xmlns:r="http://schemas.openxmlformats.org/officeDocument/2006/relationships" xmlns:m="http://schemas.openxmlformats.org/officeDocument/2006/math" xmlns:v="urn:schemas-microsoft-com:vml" xmlns:wp14="http://schemas.microsoft.com/office/word/2010/wordprocessingDrawing" xmlns:wp="http://schemas.openxmlformats.org/drawingml/2006/wordprocessingDrawing" xmlns:w10="urn:schemas-microsoft-com:office:word" xmlns:w="http://schemas.openxmlformats.org/wordprocessingml/2006/main" xmlns:w14="http://schemas.microsoft.com/office/word/2010/wordml" xmlns:w15="http://schemas.microsoft.com/office/word/2012/wordml" xmlns:w16cex="http://schemas.microsoft.com/office/word/2018/wordml/cex" xmlns:w16cid="http://schemas.microsoft.com/office/word/2016/wordml/cid" xmlns:w16="http://schemas.microsoft.com/office/word/2018/wordml" xmlns:w16du="http://schemas.microsoft.com/office/word/2023/wordml/word16du" xmlns:w16sdtdh="http://schemas.microsoft.com/office/word/2020/wordml/sdtdatahash" xmlns:w16sdtfl="http://schemas.microsoft.com/office/word/2024/wordml/sdtformatlock" xmlns:w16se="http://schemas.microsoft.com/office/word/2015/wordml/symex" xmlns:wpg="http://schemas.microsoft.com/office/word/2010/wordprocessingGroup" xmlns:wpi="http://schemas.microsoft.com/office/word/2010/wordprocessingInk" xmlns:wne="http://schemas.microsoft.com/office/word/2006/wordml" xmlns:wps="http://schemas.microsoft.com/office/word/2010/wordprocessingShape" mc:Ignorable="w14 w15 w16se w16cid w16 w16cex w16sdtdh w16sdtfl w16du wp14">
   <w:abstractNum w:abstractNumId="0" w15:restartNumberingAfterBreak="0">
+    <w:nsid w:val="0CFC4A47"/>
+    <w:multiLevelType w:val="hybridMultilevel"/>
+    <w:tmpl w:val="73DE9546"/>
+    <w:lvl w:ilvl="0" w:tplc="0409000F">
+      <w:start w:val="1"/>
+      <w:numFmt w:val="decimal"/>
+      <w:lvlText w:val="%1."/>
+      <w:lvlJc w:val="left"/>
+      <w:pPr>
+        <w:ind w:left="720" w:hanging="360"/>
+      </w:pPr>
+    </w:lvl>
+    <w:lvl w:ilvl="1" w:tplc="04090019">
+      <w:start w:val="1"/>
+      <w:numFmt w:val="lowerLetter"/>
+      <w:lvlText w:val="%2."/>
+      <w:lvlJc w:val="left"/>
+      <w:pPr>
+        <w:ind w:left="1440" w:hanging="360"/>
+      </w:pPr>
+    </w:lvl>
+    <w:lvl w:ilvl="2" w:tplc="0409001B" w:tentative="1">
+      <w:start w:val="1"/>
+      <w:numFmt w:val="lowerRoman"/>
+      <w:lvlText w:val="%3."/>
+      <w:lvlJc w:val="right"/>
+      <w:pPr>
+        <w:ind w:left="2160" w:hanging="180"/>
+      </w:pPr>
+    </w:lvl>
+    <w:lvl w:ilvl="3" w:tplc="0409000F" w:tentative="1">
+      <w:start w:val="1"/>
+      <w:numFmt w:val="decimal"/>
+      <w:lvlText w:val="%4."/>
+      <w:lvlJc w:val="left"/>
+      <w:pPr>
+        <w:ind w:left="2880" w:hanging="360"/>
+      </w:pPr>
+    </w:lvl>
+    <w:lvl w:ilvl="4" w:tplc="04090019" w:tentative="1">
+      <w:start w:val="1"/>
+      <w:numFmt w:val="lowerLetter"/>
+      <w:lvlText w:val="%5."/>
+      <w:lvlJc w:val="left"/>
+      <w:pPr>
+        <w:ind w:left="3600" w:hanging="360"/>
+      </w:pPr>
+    </w:lvl>
+    <w:lvl w:ilvl="5" w:tplc="0409001B" w:tentative="1">
+      <w:start w:val="1"/>
+      <w:numFmt w:val="lowerRoman"/>
+      <w:lvlText w:val="%6."/>
+      <w:lvlJc w:val="right"/>
+      <w:pPr>
+        <w:ind w:left="4320" w:hanging="180"/>
+      </w:pPr>
+    </w:lvl>
+    <w:lvl w:ilvl="6" w:tplc="0409000F" w:tentative="1">
+      <w:start w:val="1"/>
+      <w:numFmt w:val="decimal"/>
+      <w:lvlText w:val="%7."/>
+      <w:lvlJc w:val="left"/>
+      <w:pPr>
+        <w:ind w:left="5040" w:hanging="360"/>
+      </w:pPr>
+    </w:lvl>
+    <w:lvl w:ilvl="7" w:tplc="04090019" w:tentative="1">
+      <w:start w:val="1"/>
+      <w:numFmt w:val="lowerLetter"/>
+      <w:lvlText w:val="%8."/>
+      <w:lvlJc w:val="left"/>
+      <w:pPr>
+        <w:ind w:left="5760" w:hanging="360"/>
+      </w:pPr>
+    </w:lvl>
+    <w:lvl w:ilvl="8" w:tplc="0409001B" w:tentative="1">
+      <w:start w:val="1"/>
+      <w:numFmt w:val="lowerRoman"/>
+      <w:lvlText w:val="%9."/>
+      <w:lvlJc w:val="right"/>
+      <w:pPr>
+        <w:ind w:left="6480" w:hanging="180"/>
+      </w:pPr>
+    </w:lvl>
+  </w:abstractNum>
+  <w:abstractNum w:abstractNumId="1" w15:restartNumberingAfterBreak="0">
     <w:nsid w:val="38281FB0"/>
     <w:multiLevelType w:val="hybridMultilevel"/>
     <w:tmpl w:val="A4004038"/>
@@ -348,7 +774,7 @@
       </w:pPr>
     </w:lvl>
   </w:abstractNum>
-  <w:abstractNum w:abstractNumId="1" w15:restartNumberingAfterBreak="0">
+  <w:abstractNum w:abstractNumId="2" w15:restartNumberingAfterBreak="0">
     <w:nsid w:val="4A347CE4"/>
     <w:multiLevelType w:val="hybridMultilevel"/>
     <w:tmpl w:val="2E2EEB2A"/>
@@ -461,7 +887,7 @@
       </w:rPr>
     </w:lvl>
   </w:abstractNum>
-  <w:abstractNum w:abstractNumId="2" w15:restartNumberingAfterBreak="0">
+  <w:abstractNum w:abstractNumId="3" w15:restartNumberingAfterBreak="0">
     <w:nsid w:val="51CC3E62"/>
     <w:multiLevelType w:val="hybridMultilevel"/>
     <w:tmpl w:val="E1C85F6E"/>
@@ -574,14 +1000,133 @@
       </w:rPr>
     </w:lvl>
   </w:abstractNum>
+  <w:abstractNum w:abstractNumId="4" w15:restartNumberingAfterBreak="0">
+    <w:nsid w:val="6FED3890"/>
+    <w:multiLevelType w:val="multilevel"/>
+    <w:tmpl w:val="68CA93B0"/>
+    <w:lvl w:ilvl="0">
+      <w:start w:val="6"/>
+      <w:numFmt w:val="decimal"/>
+      <w:lvlText w:val="%1."/>
+      <w:lvlJc w:val="left"/>
+      <w:pPr>
+        <w:tabs>
+          <w:tab w:val="num" w:pos="720"/>
+        </w:tabs>
+        <w:ind w:left="720" w:hanging="360"/>
+      </w:pPr>
+    </w:lvl>
+    <w:lvl w:ilvl="1" w:tentative="1">
+      <w:start w:val="1"/>
+      <w:numFmt w:val="decimal"/>
+      <w:lvlText w:val="%2."/>
+      <w:lvlJc w:val="left"/>
+      <w:pPr>
+        <w:tabs>
+          <w:tab w:val="num" w:pos="1440"/>
+        </w:tabs>
+        <w:ind w:left="1440" w:hanging="360"/>
+      </w:pPr>
+    </w:lvl>
+    <w:lvl w:ilvl="2" w:tentative="1">
+      <w:start w:val="1"/>
+      <w:numFmt w:val="decimal"/>
+      <w:lvlText w:val="%3."/>
+      <w:lvlJc w:val="left"/>
+      <w:pPr>
+        <w:tabs>
+          <w:tab w:val="num" w:pos="2160"/>
+        </w:tabs>
+        <w:ind w:left="2160" w:hanging="360"/>
+      </w:pPr>
+    </w:lvl>
+    <w:lvl w:ilvl="3" w:tentative="1">
+      <w:start w:val="1"/>
+      <w:numFmt w:val="decimal"/>
+      <w:lvlText w:val="%4."/>
+      <w:lvlJc w:val="left"/>
+      <w:pPr>
+        <w:tabs>
+          <w:tab w:val="num" w:pos="2880"/>
+        </w:tabs>
+        <w:ind w:left="2880" w:hanging="360"/>
+      </w:pPr>
+    </w:lvl>
+    <w:lvl w:ilvl="4" w:tentative="1">
+      <w:start w:val="1"/>
+      <w:numFmt w:val="decimal"/>
+      <w:lvlText w:val="%5."/>
+      <w:lvlJc w:val="left"/>
+      <w:pPr>
+        <w:tabs>
+          <w:tab w:val="num" w:pos="3600"/>
+        </w:tabs>
+        <w:ind w:left="3600" w:hanging="360"/>
+      </w:pPr>
+    </w:lvl>
+    <w:lvl w:ilvl="5" w:tentative="1">
+      <w:start w:val="1"/>
+      <w:numFmt w:val="decimal"/>
+      <w:lvlText w:val="%6."/>
+      <w:lvlJc w:val="left"/>
+      <w:pPr>
+        <w:tabs>
+          <w:tab w:val="num" w:pos="4320"/>
+        </w:tabs>
+        <w:ind w:left="4320" w:hanging="360"/>
+      </w:pPr>
+    </w:lvl>
+    <w:lvl w:ilvl="6" w:tentative="1">
+      <w:start w:val="1"/>
+      <w:numFmt w:val="decimal"/>
+      <w:lvlText w:val="%7."/>
+      <w:lvlJc w:val="left"/>
+      <w:pPr>
+        <w:tabs>
+          <w:tab w:val="num" w:pos="5040"/>
+        </w:tabs>
+        <w:ind w:left="5040" w:hanging="360"/>
+      </w:pPr>
+    </w:lvl>
+    <w:lvl w:ilvl="7" w:tentative="1">
+      <w:start w:val="1"/>
+      <w:numFmt w:val="decimal"/>
+      <w:lvlText w:val="%8."/>
+      <w:lvlJc w:val="left"/>
+      <w:pPr>
+        <w:tabs>
+          <w:tab w:val="num" w:pos="5760"/>
+        </w:tabs>
+        <w:ind w:left="5760" w:hanging="360"/>
+      </w:pPr>
+    </w:lvl>
+    <w:lvl w:ilvl="8" w:tentative="1">
+      <w:start w:val="1"/>
+      <w:numFmt w:val="decimal"/>
+      <w:lvlText w:val="%9."/>
+      <w:lvlJc w:val="left"/>
+      <w:pPr>
+        <w:tabs>
+          <w:tab w:val="num" w:pos="6480"/>
+        </w:tabs>
+        <w:ind w:left="6480" w:hanging="360"/>
+      </w:pPr>
+    </w:lvl>
+  </w:abstractNum>
   <w:num w:numId="1" w16cid:durableId="637148633">
-    <w:abstractNumId w:val="0"/>
+    <w:abstractNumId w:val="1"/>
   </w:num>
   <w:num w:numId="2" w16cid:durableId="488254298">
+    <w:abstractNumId w:val="3"/>
+  </w:num>
+  <w:num w:numId="3" w16cid:durableId="1885175104">
     <w:abstractNumId w:val="2"/>
   </w:num>
-  <w:num w:numId="3" w16cid:durableId="1885175104">
-    <w:abstractNumId w:val="1"/>
+  <w:num w:numId="4" w16cid:durableId="801846467">
+    <w:abstractNumId w:val="4"/>
+  </w:num>
+  <w:num w:numId="5" w16cid:durableId="52047521">
+    <w:abstractNumId w:val="0"/>
   </w:num>
 </w:numbering>
 </file>

</xml_diff>